<commit_message>
Gold button style for slider controls, update CV
</commit_message>
<xml_diff>
--- a/assets/Charles_Marvin_Alo_CV_2026.docx
+++ b/assets/Charles_Marvin_Alo_CV_2026.docx
@@ -813,7 +813,7 @@
           <w:szCs w:val="20"/>
           <w:rtl w:val="0"/>
         </w:rPr>
-        <w:t xml:space="preserve">Vlog Migration Tool – integrated YouTube and Vimeo APIs to programmatically extract video metadata and embed links, eliminating manual scraping and saving 1+ hour per every 30 videos migrated.</w:t>
+        <w:t xml:space="preserve">Vlog Migration Tool – integrated YouTube and Vimeo APIs to programmatically extract video metadata and embed links, eliminating manual scraping and saving 1+ hour per 30 videos migrated.</w:t>
       </w:r>
     </w:p>
     <w:p>
@@ -1115,7 +1115,7 @@
           <w:szCs w:val="20"/>
           <w:rtl w:val="0"/>
         </w:rPr>
-        <w:t xml:space="preserve">Mar 2022 - May 2022</w:t>
+        <w:t xml:space="preserve">Mar 2022 - Jun 2022</w:t>
         <w:br w:type="textWrapping"/>
       </w:r>
     </w:p>
@@ -1305,7 +1305,7 @@
           <w:szCs w:val="20"/>
           <w:rtl w:val="0"/>
         </w:rPr>
-        <w:t xml:space="preserve">Grab-All-You-Can Award winner — among first 10 drivers to complete 500 trips/month for 6 consecutive months.</w:t>
+        <w:t xml:space="preserve">Grab-All-You-Can Award winner — among the first 10 drivers to complete 500 trips/month for 6 consecutive months.</w:t>
         <w:br w:type="textWrapping"/>
       </w:r>
     </w:p>

</xml_diff>